<commit_message>
Update fish burger plan: correct deadline schedule (7th round closed)
7th round (May 29) already passed as of June 3, 2026.
Target is now 8th round (July 31). Added updated schedule table
covering 8th-10th rounds plus final submission deadlines (R9.1.29
for grant application, R9.2.26 for performance report). Added
8-week action plan toward the July 31 deadline.

https://claude.ai/code/session_01A9vChQCf26FV1PnWvvYt7x
</commit_message>
<xml_diff>
--- a/00_能登フィッシュバーガー_事業計画書骨子_確定版.docx
+++ b/00_能登フィッシュバーガー_事業計画書骨子_確定版.docx
@@ -2198,6 +2198,967 @@
         <w:t>★ 7次が間に合わなければ8次（7/31）へ。試作結果を添付でき採択率が上がる。</w:t>
       </w:r>
     </w:p>
+    <w:p>
+      <w:pPr>
+        <w:jc w:val="center"/>
+      </w:pPr>
+      <w:r>
+        <w:rPr>
+          <w:color w:val="1F497D"/>
+          <w:sz w:val="18"/>
+        </w:rPr>
+        <w:t>━━━━━━━━━━━━━━━━━━━━━━━━━━━━━━━━━━━━━━━━</w:t>
+      </w:r>
+    </w:p>
+    <w:p>
+      <w:pPr>
+        <w:pStyle w:val="Heading2"/>
+        <w:shd w:val="clear" w:color="auto" w:fill="C00000"/>
+        <w:spacing w:before="200" w:after="80"/>
+      </w:pPr>
+      <w:r>
+        <w:rPr>
+          <w:rFonts w:ascii="メイリオ" w:hAnsi="メイリオ" w:eastAsia="メイリオ"/>
+          <w:color w:val="FFFFFF"/>
+          <w:sz w:val="24"/>
+        </w:rPr>
+        <w:t>【重要更新】申請締切スケジュール（2026年6月3日時点）</w:t>
+      </w:r>
+    </w:p>
+    <w:p>
+      <w:pPr>
+        <w:shd w:val="clear" w:color="auto" w:fill="FCE4D6"/>
+        <w:spacing w:after="120"/>
+        <w:ind w:left="170"/>
+      </w:pPr>
+      <w:r>
+        <w:rPr>
+          <w:rFonts w:ascii="メイリオ" w:hAnsi="メイリオ" w:eastAsia="メイリオ"/>
+          <w:color w:val="C00000"/>
+          <w:sz w:val="18"/>
+        </w:rPr>
+        <w:t>⚠️ 7次締切（令和8年5月29日）はすでに終了。次の目標は8次（令和8年7月31日）。試作テストの結果を添付できるため、むしろ採択率が上がる。</w:t>
+      </w:r>
+    </w:p>
+    <w:tbl>
+      <w:tblPr>
+        <w:tblStyle w:val="TableGrid"/>
+        <w:tblW w:type="auto" w:w="0"/>
+        <w:tblLook w:firstColumn="1" w:firstRow="1" w:lastColumn="0" w:lastRow="0" w:noHBand="0" w:noVBand="1" w:val="04A0"/>
+      </w:tblPr>
+      <w:tblGrid>
+        <w:gridCol w:w="2436"/>
+        <w:gridCol w:w="2436"/>
+        <w:gridCol w:w="2436"/>
+        <w:gridCol w:w="2436"/>
+      </w:tblGrid>
+      <w:tr>
+        <w:tc>
+          <w:tcPr>
+            <w:tcW w:type="dxa" w:w="2436"/>
+            <w:shd w:val="clear" w:color="auto" w:fill="C00000"/>
+          </w:tcPr>
+          <w:p>
+            <w:r>
+              <w:rPr>
+                <w:rFonts w:ascii="メイリオ" w:hAnsi="メイリオ" w:eastAsia="メイリオ"/>
+                <w:b/>
+                <w:color w:val="FFFFFF"/>
+                <w:sz w:val="18"/>
+              </w:rPr>
+              <w:t>回次</w:t>
+            </w:r>
+          </w:p>
+        </w:tc>
+        <w:tc>
+          <w:tcPr>
+            <w:tcW w:type="dxa" w:w="2436"/>
+            <w:shd w:val="clear" w:color="auto" w:fill="C00000"/>
+          </w:tcPr>
+          <w:p>
+            <w:r>
+              <w:rPr>
+                <w:rFonts w:ascii="メイリオ" w:hAnsi="メイリオ" w:eastAsia="メイリオ"/>
+                <w:b/>
+                <w:color w:val="FFFFFF"/>
+                <w:sz w:val="18"/>
+              </w:rPr>
+              <w:t>締切日</w:t>
+            </w:r>
+          </w:p>
+        </w:tc>
+        <w:tc>
+          <w:tcPr>
+            <w:tcW w:type="dxa" w:w="2436"/>
+            <w:shd w:val="clear" w:color="auto" w:fill="C00000"/>
+          </w:tcPr>
+          <w:p>
+            <w:r>
+              <w:rPr>
+                <w:rFonts w:ascii="メイリオ" w:hAnsi="メイリオ" w:eastAsia="メイリオ"/>
+                <w:b/>
+                <w:color w:val="FFFFFF"/>
+                <w:sz w:val="18"/>
+              </w:rPr>
+              <w:t>状況</w:t>
+            </w:r>
+          </w:p>
+        </w:tc>
+        <w:tc>
+          <w:tcPr>
+            <w:tcW w:type="dxa" w:w="2436"/>
+            <w:shd w:val="clear" w:color="auto" w:fill="C00000"/>
+          </w:tcPr>
+          <w:p>
+            <w:r>
+              <w:rPr>
+                <w:rFonts w:ascii="メイリオ" w:hAnsi="メイリオ" w:eastAsia="メイリオ"/>
+                <w:b/>
+                <w:color w:val="FFFFFF"/>
+                <w:sz w:val="18"/>
+              </w:rPr>
+              <w:t>能登フィッシュバーガー企画との整合</w:t>
+            </w:r>
+          </w:p>
+        </w:tc>
+      </w:tr>
+      <w:tr>
+        <w:tc>
+          <w:tcPr>
+            <w:tcW w:type="dxa" w:w="2436"/>
+          </w:tcPr>
+          <w:p>
+            <w:r>
+              <w:rPr>
+                <w:rFonts w:ascii="メイリオ" w:hAnsi="メイリオ" w:eastAsia="メイリオ"/>
+                <w:sz w:val="18"/>
+              </w:rPr>
+              <w:t>7次</w:t>
+            </w:r>
+          </w:p>
+        </w:tc>
+        <w:tc>
+          <w:tcPr>
+            <w:tcW w:type="dxa" w:w="2436"/>
+          </w:tcPr>
+          <w:p>
+            <w:r>
+              <w:rPr>
+                <w:rFonts w:ascii="メイリオ" w:hAnsi="メイリオ" w:eastAsia="メイリオ"/>
+                <w:sz w:val="18"/>
+              </w:rPr>
+              <w:t>R8年5月29日（金）</w:t>
+            </w:r>
+          </w:p>
+        </w:tc>
+        <w:tc>
+          <w:tcPr>
+            <w:tcW w:type="dxa" w:w="2436"/>
+          </w:tcPr>
+          <w:p>
+            <w:r>
+              <w:rPr>
+                <w:rFonts w:ascii="メイリオ" w:hAnsi="メイリオ" w:eastAsia="メイリオ"/>
+                <w:sz w:val="18"/>
+              </w:rPr>
+              <w:t>✕ 締切済み</w:t>
+            </w:r>
+          </w:p>
+        </w:tc>
+        <w:tc>
+          <w:tcPr>
+            <w:tcW w:type="dxa" w:w="2436"/>
+          </w:tcPr>
+          <w:p>
+            <w:r>
+              <w:rPr>
+                <w:rFonts w:ascii="メイリオ" w:hAnsi="メイリオ" w:eastAsia="メイリオ"/>
+                <w:sz w:val="18"/>
+              </w:rPr>
+              <w:t>—</w:t>
+            </w:r>
+          </w:p>
+        </w:tc>
+      </w:tr>
+      <w:tr>
+        <w:tc>
+          <w:tcPr>
+            <w:tcW w:type="dxa" w:w="2436"/>
+            <w:shd w:val="clear" w:color="auto" w:fill="F2F7FC"/>
+          </w:tcPr>
+          <w:p>
+            <w:r>
+              <w:rPr>
+                <w:rFonts w:ascii="メイリオ" w:hAnsi="メイリオ" w:eastAsia="メイリオ"/>
+                <w:sz w:val="18"/>
+              </w:rPr>
+              <w:t>8次 ◎目標</w:t>
+            </w:r>
+          </w:p>
+        </w:tc>
+        <w:tc>
+          <w:tcPr>
+            <w:tcW w:type="dxa" w:w="2436"/>
+            <w:shd w:val="clear" w:color="auto" w:fill="F2F7FC"/>
+          </w:tcPr>
+          <w:p>
+            <w:r>
+              <w:rPr>
+                <w:rFonts w:ascii="メイリオ" w:hAnsi="メイリオ" w:eastAsia="メイリオ"/>
+                <w:sz w:val="18"/>
+              </w:rPr>
+              <w:t>R8年7月31日（金）</w:t>
+            </w:r>
+          </w:p>
+        </w:tc>
+        <w:tc>
+          <w:tcPr>
+            <w:tcW w:type="dxa" w:w="2436"/>
+            <w:shd w:val="clear" w:color="auto" w:fill="F2F7FC"/>
+          </w:tcPr>
+          <w:p>
+            <w:r>
+              <w:rPr>
+                <w:rFonts w:ascii="メイリオ" w:hAnsi="メイリオ" w:eastAsia="メイリオ"/>
+                <w:sz w:val="18"/>
+              </w:rPr>
+              <w:t>◎ 次の締切（約2ヶ月）</w:t>
+            </w:r>
+          </w:p>
+        </w:tc>
+        <w:tc>
+          <w:tcPr>
+            <w:tcW w:type="dxa" w:w="2436"/>
+            <w:shd w:val="clear" w:color="auto" w:fill="F2F7FC"/>
+          </w:tcPr>
+          <w:p>
+            <w:r>
+              <w:rPr>
+                <w:rFonts w:ascii="メイリオ" w:hAnsi="メイリオ" w:eastAsia="メイリオ"/>
+                <w:sz w:val="18"/>
+              </w:rPr>
+              <w:t>試作テスト（7月実施）の結果を添付可能。最推奨</w:t>
+            </w:r>
+          </w:p>
+        </w:tc>
+      </w:tr>
+      <w:tr>
+        <w:tc>
+          <w:tcPr>
+            <w:tcW w:type="dxa" w:w="2436"/>
+          </w:tcPr>
+          <w:p>
+            <w:r>
+              <w:rPr>
+                <w:rFonts w:ascii="メイリオ" w:hAnsi="メイリオ" w:eastAsia="メイリオ"/>
+                <w:sz w:val="18"/>
+              </w:rPr>
+              <w:t>9次</w:t>
+            </w:r>
+          </w:p>
+        </w:tc>
+        <w:tc>
+          <w:tcPr>
+            <w:tcW w:type="dxa" w:w="2436"/>
+          </w:tcPr>
+          <w:p>
+            <w:r>
+              <w:rPr>
+                <w:rFonts w:ascii="メイリオ" w:hAnsi="メイリオ" w:eastAsia="メイリオ"/>
+                <w:sz w:val="18"/>
+              </w:rPr>
+              <w:t>R8年9月30日（水）</w:t>
+            </w:r>
+          </w:p>
+        </w:tc>
+        <w:tc>
+          <w:tcPr>
+            <w:tcW w:type="dxa" w:w="2436"/>
+          </w:tcPr>
+          <w:p>
+            <w:r>
+              <w:rPr>
+                <w:rFonts w:ascii="メイリオ" w:hAnsi="メイリオ" w:eastAsia="メイリオ"/>
+                <w:sz w:val="18"/>
+              </w:rPr>
+              <w:t>○ 予備</w:t>
+            </w:r>
+          </w:p>
+        </w:tc>
+        <w:tc>
+          <w:tcPr>
+            <w:tcW w:type="dxa" w:w="2436"/>
+          </w:tcPr>
+          <w:p>
+            <w:r>
+              <w:rPr>
+                <w:rFonts w:ascii="メイリオ" w:hAnsi="メイリオ" w:eastAsia="メイリオ"/>
+                <w:sz w:val="18"/>
+              </w:rPr>
+              <w:t>初出店実績を添付できる</w:t>
+            </w:r>
+          </w:p>
+        </w:tc>
+      </w:tr>
+      <w:tr>
+        <w:tc>
+          <w:tcPr>
+            <w:tcW w:type="dxa" w:w="2436"/>
+            <w:shd w:val="clear" w:color="auto" w:fill="F2F7FC"/>
+          </w:tcPr>
+          <w:p>
+            <w:r>
+              <w:rPr>
+                <w:rFonts w:ascii="メイリオ" w:hAnsi="メイリオ" w:eastAsia="メイリオ"/>
+                <w:sz w:val="18"/>
+              </w:rPr>
+              <w:t>10次</w:t>
+            </w:r>
+          </w:p>
+        </w:tc>
+        <w:tc>
+          <w:tcPr>
+            <w:tcW w:type="dxa" w:w="2436"/>
+            <w:shd w:val="clear" w:color="auto" w:fill="F2F7FC"/>
+          </w:tcPr>
+          <w:p>
+            <w:r>
+              <w:rPr>
+                <w:rFonts w:ascii="メイリオ" w:hAnsi="メイリオ" w:eastAsia="メイリオ"/>
+                <w:sz w:val="18"/>
+              </w:rPr>
+              <w:t>R8年11月30日（月）</w:t>
+            </w:r>
+          </w:p>
+        </w:tc>
+        <w:tc>
+          <w:tcPr>
+            <w:tcW w:type="dxa" w:w="2436"/>
+            <w:shd w:val="clear" w:color="auto" w:fill="F2F7FC"/>
+          </w:tcPr>
+          <w:p>
+            <w:r>
+              <w:rPr>
+                <w:rFonts w:ascii="メイリオ" w:hAnsi="メイリオ" w:eastAsia="メイリオ"/>
+                <w:sz w:val="18"/>
+              </w:rPr>
+              <w:t>○ 最終</w:t>
+            </w:r>
+          </w:p>
+        </w:tc>
+        <w:tc>
+          <w:tcPr>
+            <w:tcW w:type="dxa" w:w="2436"/>
+            <w:shd w:val="clear" w:color="auto" w:fill="F2F7FC"/>
+          </w:tcPr>
+          <w:p>
+            <w:r>
+              <w:rPr>
+                <w:rFonts w:ascii="メイリオ" w:hAnsi="メイリオ" w:eastAsia="メイリオ"/>
+                <w:sz w:val="18"/>
+              </w:rPr>
+              <w:t>販売実績・売上データを添付可能</w:t>
+            </w:r>
+          </w:p>
+        </w:tc>
+      </w:tr>
+      <w:tr>
+        <w:tc>
+          <w:tcPr>
+            <w:tcW w:type="dxa" w:w="2436"/>
+          </w:tcPr>
+          <w:p>
+            <w:r>
+              <w:rPr>
+                <w:rFonts w:ascii="メイリオ" w:hAnsi="メイリオ" w:eastAsia="メイリオ"/>
+                <w:sz w:val="18"/>
+              </w:rPr>
+              <w:t>交付申請書提出</w:t>
+            </w:r>
+          </w:p>
+        </w:tc>
+        <w:tc>
+          <w:tcPr>
+            <w:tcW w:type="dxa" w:w="2436"/>
+          </w:tcPr>
+          <w:p>
+            <w:r>
+              <w:rPr>
+                <w:rFonts w:ascii="メイリオ" w:hAnsi="メイリオ" w:eastAsia="メイリオ"/>
+                <w:sz w:val="18"/>
+              </w:rPr>
+              <w:t>R9年1月29日（金）</w:t>
+            </w:r>
+          </w:p>
+        </w:tc>
+        <w:tc>
+          <w:tcPr>
+            <w:tcW w:type="dxa" w:w="2436"/>
+          </w:tcPr>
+          <w:p>
+            <w:r>
+              <w:rPr>
+                <w:rFonts w:ascii="メイリオ" w:hAnsi="メイリオ" w:eastAsia="メイリオ"/>
+                <w:sz w:val="18"/>
+              </w:rPr>
+              <w:t>7〜10次共通</w:t>
+            </w:r>
+          </w:p>
+        </w:tc>
+        <w:tc>
+          <w:tcPr>
+            <w:tcW w:type="dxa" w:w="2436"/>
+          </w:tcPr>
+          <w:p>
+            <w:r>
+              <w:rPr>
+                <w:rFonts w:ascii="メイリオ" w:hAnsi="メイリオ" w:eastAsia="メイリオ"/>
+                <w:sz w:val="18"/>
+              </w:rPr>
+              <w:t>交付決定後に提出</w:t>
+            </w:r>
+          </w:p>
+        </w:tc>
+      </w:tr>
+      <w:tr>
+        <w:tc>
+          <w:tcPr>
+            <w:tcW w:type="dxa" w:w="2436"/>
+            <w:shd w:val="clear" w:color="auto" w:fill="F2F7FC"/>
+          </w:tcPr>
+          <w:p>
+            <w:r>
+              <w:rPr>
+                <w:rFonts w:ascii="メイリオ" w:hAnsi="メイリオ" w:eastAsia="メイリオ"/>
+                <w:sz w:val="18"/>
+              </w:rPr>
+              <w:t>実績報告書提出</w:t>
+            </w:r>
+          </w:p>
+        </w:tc>
+        <w:tc>
+          <w:tcPr>
+            <w:tcW w:type="dxa" w:w="2436"/>
+            <w:shd w:val="clear" w:color="auto" w:fill="F2F7FC"/>
+          </w:tcPr>
+          <w:p>
+            <w:r>
+              <w:rPr>
+                <w:rFonts w:ascii="メイリオ" w:hAnsi="メイリオ" w:eastAsia="メイリオ"/>
+                <w:sz w:val="18"/>
+              </w:rPr>
+              <w:t>R9年2月26日（金）</w:t>
+            </w:r>
+          </w:p>
+        </w:tc>
+        <w:tc>
+          <w:tcPr>
+            <w:tcW w:type="dxa" w:w="2436"/>
+            <w:shd w:val="clear" w:color="auto" w:fill="F2F7FC"/>
+          </w:tcPr>
+          <w:p>
+            <w:r>
+              <w:rPr>
+                <w:rFonts w:ascii="メイリオ" w:hAnsi="メイリオ" w:eastAsia="メイリオ"/>
+                <w:sz w:val="18"/>
+              </w:rPr>
+              <w:t>7〜10次共通</w:t>
+            </w:r>
+          </w:p>
+        </w:tc>
+        <w:tc>
+          <w:tcPr>
+            <w:tcW w:type="dxa" w:w="2436"/>
+            <w:shd w:val="clear" w:color="auto" w:fill="F2F7FC"/>
+          </w:tcPr>
+          <w:p>
+            <w:r>
+              <w:rPr>
+                <w:rFonts w:ascii="メイリオ" w:hAnsi="メイリオ" w:eastAsia="メイリオ"/>
+                <w:sz w:val="18"/>
+              </w:rPr>
+              <w:t>補助事業完了後に提出</w:t>
+            </w:r>
+          </w:p>
+        </w:tc>
+      </w:tr>
+    </w:tbl>
+    <w:p/>
+    <w:p>
+      <w:pPr>
+        <w:pStyle w:val="Heading2"/>
+        <w:shd w:val="clear" w:color="auto" w:fill="1F497D"/>
+        <w:spacing w:before="200" w:after="80"/>
+      </w:pPr>
+      <w:r>
+        <w:rPr>
+          <w:rFonts w:ascii="メイリオ" w:hAnsi="メイリオ" w:eastAsia="メイリオ"/>
+          <w:color w:val="FFFFFF"/>
+          <w:sz w:val="24"/>
+        </w:rPr>
+        <w:t>8次（7月31日）に向けた行動計画</w:t>
+      </w:r>
+    </w:p>
+    <w:p>
+      <w:pPr>
+        <w:shd w:val="clear" w:color="auto" w:fill="FFF2CC"/>
+        <w:spacing w:after="120"/>
+        <w:ind w:left="170"/>
+      </w:pPr>
+      <w:r>
+        <w:rPr>
+          <w:rFonts w:ascii="メイリオ" w:hAnsi="メイリオ" w:eastAsia="メイリオ"/>
+          <w:color w:val="7F6000"/>
+          <w:sz w:val="18"/>
+        </w:rPr>
+        <w:t>今日（6月3日）から7月31日まで約2ヶ月。試作テストを済ませてから申請できる絶好のタイミング。</w:t>
+      </w:r>
+    </w:p>
+    <w:tbl>
+      <w:tblPr>
+        <w:tblStyle w:val="TableGrid"/>
+        <w:tblW w:type="auto" w:w="0"/>
+        <w:tblLook w:firstColumn="1" w:firstRow="1" w:lastColumn="0" w:lastRow="0" w:noHBand="0" w:noVBand="1" w:val="04A0"/>
+      </w:tblPr>
+      <w:tblGrid>
+        <w:gridCol w:w="3249"/>
+        <w:gridCol w:w="3249"/>
+        <w:gridCol w:w="3249"/>
+      </w:tblGrid>
+      <w:tr>
+        <w:tc>
+          <w:tcPr>
+            <w:tcW w:type="dxa" w:w="3249"/>
+            <w:shd w:val="clear" w:color="auto" w:fill="1F497D"/>
+          </w:tcPr>
+          <w:p>
+            <w:r>
+              <w:rPr>
+                <w:rFonts w:ascii="メイリオ" w:hAnsi="メイリオ" w:eastAsia="メイリオ"/>
+                <w:b/>
+                <w:color w:val="FFFFFF"/>
+                <w:sz w:val="18"/>
+              </w:rPr>
+              <w:t>期間</w:t>
+            </w:r>
+          </w:p>
+        </w:tc>
+        <w:tc>
+          <w:tcPr>
+            <w:tcW w:type="dxa" w:w="3249"/>
+            <w:shd w:val="clear" w:color="auto" w:fill="1F497D"/>
+          </w:tcPr>
+          <w:p>
+            <w:r>
+              <w:rPr>
+                <w:rFonts w:ascii="メイリオ" w:hAnsi="メイリオ" w:eastAsia="メイリオ"/>
+                <w:b/>
+                <w:color w:val="FFFFFF"/>
+                <w:sz w:val="18"/>
+              </w:rPr>
+              <w:t>アクション</w:t>
+            </w:r>
+          </w:p>
+        </w:tc>
+        <w:tc>
+          <w:tcPr>
+            <w:tcW w:type="dxa" w:w="3249"/>
+            <w:shd w:val="clear" w:color="auto" w:fill="1F497D"/>
+          </w:tcPr>
+          <w:p>
+            <w:r>
+              <w:rPr>
+                <w:rFonts w:ascii="メイリオ" w:hAnsi="メイリオ" w:eastAsia="メイリオ"/>
+                <w:b/>
+                <w:color w:val="FFFFFF"/>
+                <w:sz w:val="18"/>
+              </w:rPr>
+              <w:t>担当</w:t>
+            </w:r>
+          </w:p>
+        </w:tc>
+      </w:tr>
+      <w:tr>
+        <w:tc>
+          <w:tcPr>
+            <w:tcW w:type="dxa" w:w="3249"/>
+          </w:tcPr>
+          <w:p>
+            <w:r>
+              <w:rPr>
+                <w:rFonts w:ascii="メイリオ" w:hAnsi="メイリオ" w:eastAsia="メイリオ"/>
+                <w:sz w:val="18"/>
+              </w:rPr>
+              <w:t>6月上旬（今週中）</w:t>
+            </w:r>
+          </w:p>
+        </w:tc>
+        <w:tc>
+          <w:tcPr>
+            <w:tcW w:type="dxa" w:w="3249"/>
+          </w:tcPr>
+          <w:p>
+            <w:r>
+              <w:rPr>
+                <w:rFonts w:ascii="メイリオ" w:hAnsi="メイリオ" w:eastAsia="メイリオ"/>
+                <w:sz w:val="18"/>
+              </w:rPr>
+              <w:t>能登事業者支援センター（0120-262-380）に連絡。事業内容事前確認書の発行依頼</w:t>
+            </w:r>
+          </w:p>
+        </w:tc>
+        <w:tc>
+          <w:tcPr>
+            <w:tcW w:type="dxa" w:w="3249"/>
+          </w:tcPr>
+          <w:p>
+            <w:r>
+              <w:rPr>
+                <w:rFonts w:ascii="メイリオ" w:hAnsi="メイリオ" w:eastAsia="メイリオ"/>
+                <w:sz w:val="18"/>
+              </w:rPr>
+              <w:t>小川氏</w:t>
+            </w:r>
+          </w:p>
+        </w:tc>
+      </w:tr>
+      <w:tr>
+        <w:tc>
+          <w:tcPr>
+            <w:tcW w:type="dxa" w:w="3249"/>
+            <w:shd w:val="clear" w:color="auto" w:fill="F2F7FC"/>
+          </w:tcPr>
+          <w:p>
+            <w:r>
+              <w:rPr>
+                <w:rFonts w:ascii="メイリオ" w:hAnsi="メイリオ" w:eastAsia="メイリオ"/>
+                <w:sz w:val="18"/>
+              </w:rPr>
+              <w:t>6月上旬</w:t>
+            </w:r>
+          </w:p>
+        </w:tc>
+        <w:tc>
+          <w:tcPr>
+            <w:tcW w:type="dxa" w:w="3249"/>
+            <w:shd w:val="clear" w:color="auto" w:fill="F2F7FC"/>
+          </w:tcPr>
+          <w:p>
+            <w:r>
+              <w:rPr>
+                <w:rFonts w:ascii="メイリオ" w:hAnsi="メイリオ" w:eastAsia="メイリオ"/>
+                <w:sz w:val="18"/>
+              </w:rPr>
+              <w:t>漁協証明・確定申告書を取り寄せ。震災前後の売上データを整備</w:t>
+            </w:r>
+          </w:p>
+        </w:tc>
+        <w:tc>
+          <w:tcPr>
+            <w:tcW w:type="dxa" w:w="3249"/>
+            <w:shd w:val="clear" w:color="auto" w:fill="F2F7FC"/>
+          </w:tcPr>
+          <w:p>
+            <w:r>
+              <w:rPr>
+                <w:rFonts w:ascii="メイリオ" w:hAnsi="メイリオ" w:eastAsia="メイリオ"/>
+                <w:sz w:val="18"/>
+              </w:rPr>
+              <w:t>小川氏</w:t>
+            </w:r>
+          </w:p>
+        </w:tc>
+      </w:tr>
+      <w:tr>
+        <w:tc>
+          <w:tcPr>
+            <w:tcW w:type="dxa" w:w="3249"/>
+          </w:tcPr>
+          <w:p>
+            <w:r>
+              <w:rPr>
+                <w:rFonts w:ascii="メイリオ" w:hAnsi="メイリオ" w:eastAsia="メイリオ"/>
+                <w:sz w:val="18"/>
+              </w:rPr>
+              <w:t>6月中旬</w:t>
+            </w:r>
+          </w:p>
+        </w:tc>
+        <w:tc>
+          <w:tcPr>
+            <w:tcW w:type="dxa" w:w="3249"/>
+          </w:tcPr>
+          <w:p>
+            <w:r>
+              <w:rPr>
+                <w:rFonts w:ascii="メイリオ" w:hAnsi="メイリオ" w:eastAsia="メイリオ"/>
+                <w:sz w:val="18"/>
+              </w:rPr>
+              <w:t>能登町商工会で計画策定確認書の準備開始</w:t>
+            </w:r>
+          </w:p>
+        </w:tc>
+        <w:tc>
+          <w:tcPr>
+            <w:tcW w:type="dxa" w:w="3249"/>
+          </w:tcPr>
+          <w:p>
+            <w:r>
+              <w:rPr>
+                <w:rFonts w:ascii="メイリオ" w:hAnsi="メイリオ" w:eastAsia="メイリオ"/>
+                <w:sz w:val="18"/>
+              </w:rPr>
+              <w:t>小川氏</w:t>
+            </w:r>
+          </w:p>
+        </w:tc>
+      </w:tr>
+      <w:tr>
+        <w:tc>
+          <w:tcPr>
+            <w:tcW w:type="dxa" w:w="3249"/>
+            <w:shd w:val="clear" w:color="auto" w:fill="F2F7FC"/>
+          </w:tcPr>
+          <w:p>
+            <w:r>
+              <w:rPr>
+                <w:rFonts w:ascii="メイリオ" w:hAnsi="メイリオ" w:eastAsia="メイリオ"/>
+                <w:sz w:val="18"/>
+              </w:rPr>
+              <w:t>6月中旬〜下旬</w:t>
+            </w:r>
+          </w:p>
+        </w:tc>
+        <w:tc>
+          <w:tcPr>
+            <w:tcW w:type="dxa" w:w="3249"/>
+            <w:shd w:val="clear" w:color="auto" w:fill="F2F7FC"/>
+          </w:tcPr>
+          <w:p>
+            <w:r>
+              <w:rPr>
+                <w:rFonts w:ascii="メイリオ" w:hAnsi="メイリオ" w:eastAsia="メイリオ"/>
+                <w:sz w:val="18"/>
+              </w:rPr>
+              <w:t>事業計画書を米永（CBC）と共同作成。起業促進との経費分離を明記</w:t>
+            </w:r>
+          </w:p>
+        </w:tc>
+        <w:tc>
+          <w:tcPr>
+            <w:tcW w:type="dxa" w:w="3249"/>
+            <w:shd w:val="clear" w:color="auto" w:fill="F2F7FC"/>
+          </w:tcPr>
+          <w:p>
+            <w:r>
+              <w:rPr>
+                <w:rFonts w:ascii="メイリオ" w:hAnsi="メイリオ" w:eastAsia="メイリオ"/>
+                <w:sz w:val="18"/>
+              </w:rPr>
+              <w:t>米永＋小川</w:t>
+            </w:r>
+          </w:p>
+        </w:tc>
+      </w:tr>
+      <w:tr>
+        <w:tc>
+          <w:tcPr>
+            <w:tcW w:type="dxa" w:w="3249"/>
+          </w:tcPr>
+          <w:p>
+            <w:r>
+              <w:rPr>
+                <w:rFonts w:ascii="メイリオ" w:hAnsi="メイリオ" w:eastAsia="メイリオ"/>
+                <w:sz w:val="18"/>
+              </w:rPr>
+              <w:t>7月上旬</w:t>
+            </w:r>
+          </w:p>
+        </w:tc>
+        <w:tc>
+          <w:tcPr>
+            <w:tcW w:type="dxa" w:w="3249"/>
+          </w:tcPr>
+          <w:p>
+            <w:r>
+              <w:rPr>
+                <w:rFonts w:ascii="メイリオ" w:hAnsi="メイリオ" w:eastAsia="メイリオ"/>
+                <w:sz w:val="18"/>
+              </w:rPr>
+              <w:t>試作テスト実施・評価シート作成（写真・参加者コメント）→ 申請書に添付</w:t>
+            </w:r>
+          </w:p>
+        </w:tc>
+        <w:tc>
+          <w:tcPr>
+            <w:tcW w:type="dxa" w:w="3249"/>
+          </w:tcPr>
+          <w:p>
+            <w:r>
+              <w:rPr>
+                <w:rFonts w:ascii="メイリオ" w:hAnsi="メイリオ" w:eastAsia="メイリオ"/>
+                <w:sz w:val="18"/>
+              </w:rPr>
+              <w:t>全員</w:t>
+            </w:r>
+          </w:p>
+        </w:tc>
+      </w:tr>
+      <w:tr>
+        <w:tc>
+          <w:tcPr>
+            <w:tcW w:type="dxa" w:w="3249"/>
+            <w:shd w:val="clear" w:color="auto" w:fill="F2F7FC"/>
+          </w:tcPr>
+          <w:p>
+            <w:r>
+              <w:rPr>
+                <w:rFonts w:ascii="メイリオ" w:hAnsi="メイリオ" w:eastAsia="メイリオ"/>
+                <w:sz w:val="18"/>
+              </w:rPr>
+              <w:t>7月中旬</w:t>
+            </w:r>
+          </w:p>
+        </w:tc>
+        <w:tc>
+          <w:tcPr>
+            <w:tcW w:type="dxa" w:w="3249"/>
+            <w:shd w:val="clear" w:color="auto" w:fill="F2F7FC"/>
+          </w:tcPr>
+          <w:p>
+            <w:r>
+              <w:rPr>
+                <w:rFonts w:ascii="メイリオ" w:hAnsi="メイリオ" w:eastAsia="メイリオ"/>
+                <w:sz w:val="18"/>
+              </w:rPr>
+              <w:t>書類一式を最終確認。能登センターで計画策定確認書を受領</w:t>
+            </w:r>
+          </w:p>
+        </w:tc>
+        <w:tc>
+          <w:tcPr>
+            <w:tcW w:type="dxa" w:w="3249"/>
+            <w:shd w:val="clear" w:color="auto" w:fill="F2F7FC"/>
+          </w:tcPr>
+          <w:p>
+            <w:r>
+              <w:rPr>
+                <w:rFonts w:ascii="メイリオ" w:hAnsi="メイリオ" w:eastAsia="メイリオ"/>
+                <w:sz w:val="18"/>
+              </w:rPr>
+              <w:t>小川氏</w:t>
+            </w:r>
+          </w:p>
+        </w:tc>
+      </w:tr>
+      <w:tr>
+        <w:tc>
+          <w:tcPr>
+            <w:tcW w:type="dxa" w:w="3249"/>
+          </w:tcPr>
+          <w:p>
+            <w:r>
+              <w:rPr>
+                <w:rFonts w:ascii="メイリオ" w:hAnsi="メイリオ" w:eastAsia="メイリオ"/>
+                <w:sz w:val="18"/>
+              </w:rPr>
+              <w:t>7月31日</w:t>
+            </w:r>
+          </w:p>
+        </w:tc>
+        <w:tc>
+          <w:tcPr>
+            <w:tcW w:type="dxa" w:w="3249"/>
+          </w:tcPr>
+          <w:p>
+            <w:r>
+              <w:rPr>
+                <w:rFonts w:ascii="メイリオ" w:hAnsi="メイリオ" w:eastAsia="メイリオ"/>
+                <w:sz w:val="18"/>
+              </w:rPr>
+              <w:t>チャレンジ支援補助金 8次 書類郵送（消印有効）</w:t>
+            </w:r>
+          </w:p>
+        </w:tc>
+        <w:tc>
+          <w:tcPr>
+            <w:tcW w:type="dxa" w:w="3249"/>
+          </w:tcPr>
+          <w:p>
+            <w:r>
+              <w:rPr>
+                <w:rFonts w:ascii="メイリオ" w:hAnsi="メイリオ" w:eastAsia="メイリオ"/>
+                <w:sz w:val="18"/>
+              </w:rPr>
+              <w:t>小川氏</w:t>
+            </w:r>
+          </w:p>
+        </w:tc>
+      </w:tr>
+      <w:tr>
+        <w:tc>
+          <w:tcPr>
+            <w:tcW w:type="dxa" w:w="3249"/>
+            <w:shd w:val="clear" w:color="auto" w:fill="F2F7FC"/>
+          </w:tcPr>
+          <w:p>
+            <w:r>
+              <w:rPr>
+                <w:rFonts w:ascii="メイリオ" w:hAnsi="メイリオ" w:eastAsia="メイリオ"/>
+                <w:sz w:val="18"/>
+              </w:rPr>
+              <w:t>並行</w:t>
+            </w:r>
+          </w:p>
+        </w:tc>
+        <w:tc>
+          <w:tcPr>
+            <w:tcW w:type="dxa" w:w="3249"/>
+            <w:shd w:val="clear" w:color="auto" w:fill="F2F7FC"/>
+          </w:tcPr>
+          <w:p>
+            <w:r>
+              <w:rPr>
+                <w:rFonts w:ascii="メイリオ" w:hAnsi="メイリオ" w:eastAsia="メイリオ"/>
+                <w:sz w:val="18"/>
+              </w:rPr>
+              <w:t>起業促進補助金も別経費・別計画で申請（締切を別途確認）</w:t>
+            </w:r>
+          </w:p>
+        </w:tc>
+        <w:tc>
+          <w:tcPr>
+            <w:tcW w:type="dxa" w:w="3249"/>
+            <w:shd w:val="clear" w:color="auto" w:fill="F2F7FC"/>
+          </w:tcPr>
+          <w:p>
+            <w:r>
+              <w:rPr>
+                <w:rFonts w:ascii="メイリオ" w:hAnsi="メイリオ" w:eastAsia="メイリオ"/>
+                <w:sz w:val="18"/>
+              </w:rPr>
+              <w:t>小川氏</w:t>
+            </w:r>
+          </w:p>
+        </w:tc>
+      </w:tr>
+    </w:tbl>
+    <w:p/>
+    <w:p>
+      <w:pPr>
+        <w:shd w:val="clear" w:color="auto" w:fill="FFF2CC"/>
+        <w:spacing w:after="120"/>
+        <w:ind w:left="170"/>
+      </w:pPr>
+      <w:r>
+        <w:rPr>
+          <w:rFonts w:ascii="メイリオ" w:hAnsi="メイリオ" w:eastAsia="メイリオ"/>
+          <w:color w:val="7F6000"/>
+          <w:sz w:val="18"/>
+        </w:rPr>
+        <w:t>★ 8次が難しい場合は9次（9/30）へ。初出店の実績写真・売上データを添付できてさらに強くなる。</w:t>
+      </w:r>
+    </w:p>
     <w:sectPr>
       <w:footerReference w:type="default" r:id="rId9"/>
       <w:pgSz w:w="12240" w:h="15840"/>
@@ -2221,7 +3182,7 @@
         <w:color w:val="707070"/>
         <w:sz w:val="16"/>
       </w:rPr>
-      <w:t>能登フィッシュバーガー 事業計画書骨子【確定版】 ／ 小川勝則（漁師）　作成：CBC（米永）</w:t>
+      <w:t>能登フィッシュバーガー 事業計画書骨子【確定版・締切更新済み 2026.6.3】 ／ 小川勝則（漁師）　作成：CBC（米永）</w:t>
     </w:r>
   </w:p>
 </w:ftr>

</xml_diff>

<commit_message>
Make fish burger plan internally consistent for 8th round
Regenerated the whole document so all references target the 8th round
(July 31) instead of the now-passed 7th round (May 29). Updated header,
schedule (June-July action plan), and removed stale 7th-round/May dates
throughout. Single consistent deadline table.

https://claude.ai/code/session_01A9vChQCf26FV1PnWvvYt7x
</commit_message>
<xml_diff>
--- a/00_能登フィッシュバーガー_事業計画書骨子_確定版.docx
+++ b/00_能登フィッシュバーガー_事業計画書骨子_確定版.docx
@@ -35,7 +35,7 @@
           <w:color w:val="707070"/>
           <w:sz w:val="17"/>
         </w:rPr>
-        <w:t>作成日：2026年6月2日　申請者：小川勝則（個人事業主・漁師）　申請回次：チャレンジ7次（R8.5.29）</w:t>
+        <w:t>作成日：2026年6月3日　申請者：小川勝則（個人事業主・漁師）　申請回次：チャレンジ8次（締切 R8.7.31）</w:t>
       </w:r>
     </w:p>
     <w:p/>
@@ -342,7 +342,7 @@
           <w:color w:val="7F6000"/>
           <w:sz w:val="18"/>
         </w:rPr>
-        <w:t>※ 2制度の併用は確認済みとのことだが、念のため「事業内容の重複がない」点を事業計画書で明確に切り分けること。各補助金の対象経費が重複しないよう経費明細を分けて管理する。</w:t>
+        <w:t>※ 2制度の併用は確認済みだが、「事業内容の重複がない」点を事業計画書で明確に切り分けること。各補助金の対象経費が重複しないよう経費明細を分けて管理する。</w:t>
       </w:r>
     </w:p>
     <w:p/>
@@ -1797,432 +1797,7 @@
           <w:color w:val="FFFFFF"/>
           <w:sz w:val="24"/>
         </w:rPr>
-        <w:t>6. 申請スケジュール</w:t>
-      </w:r>
-    </w:p>
-    <w:tbl>
-      <w:tblPr>
-        <w:tblStyle w:val="TableGrid"/>
-        <w:tblW w:type="auto" w:w="0"/>
-        <w:tblLook w:firstColumn="1" w:firstRow="1" w:lastColumn="0" w:lastRow="0" w:noHBand="0" w:noVBand="1" w:val="04A0"/>
-      </w:tblPr>
-      <w:tblGrid>
-        <w:gridCol w:w="3249"/>
-        <w:gridCol w:w="3249"/>
-        <w:gridCol w:w="3249"/>
-      </w:tblGrid>
-      <w:tr>
-        <w:tc>
-          <w:tcPr>
-            <w:tcW w:type="dxa" w:w="3249"/>
-            <w:shd w:val="clear" w:color="auto" w:fill="C00000"/>
-          </w:tcPr>
-          <w:p>
-            <w:r>
-              <w:rPr>
-                <w:rFonts w:ascii="メイリオ" w:hAnsi="メイリオ" w:eastAsia="メイリオ"/>
-                <w:b/>
-                <w:color w:val="FFFFFF"/>
-                <w:sz w:val="18"/>
-              </w:rPr>
-              <w:t>期限</w:t>
-            </w:r>
-          </w:p>
-        </w:tc>
-        <w:tc>
-          <w:tcPr>
-            <w:tcW w:type="dxa" w:w="3249"/>
-            <w:shd w:val="clear" w:color="auto" w:fill="C00000"/>
-          </w:tcPr>
-          <w:p>
-            <w:r>
-              <w:rPr>
-                <w:rFonts w:ascii="メイリオ" w:hAnsi="メイリオ" w:eastAsia="メイリオ"/>
-                <w:b/>
-                <w:color w:val="FFFFFF"/>
-                <w:sz w:val="18"/>
-              </w:rPr>
-              <w:t>アクション</w:t>
-            </w:r>
-          </w:p>
-        </w:tc>
-        <w:tc>
-          <w:tcPr>
-            <w:tcW w:type="dxa" w:w="3249"/>
-            <w:shd w:val="clear" w:color="auto" w:fill="C00000"/>
-          </w:tcPr>
-          <w:p>
-            <w:r>
-              <w:rPr>
-                <w:rFonts w:ascii="メイリオ" w:hAnsi="メイリオ" w:eastAsia="メイリオ"/>
-                <w:b/>
-                <w:color w:val="FFFFFF"/>
-                <w:sz w:val="18"/>
-              </w:rPr>
-              <w:t>担当</w:t>
-            </w:r>
-          </w:p>
-        </w:tc>
-      </w:tr>
-      <w:tr>
-        <w:tc>
-          <w:tcPr>
-            <w:tcW w:type="dxa" w:w="3249"/>
-          </w:tcPr>
-          <w:p>
-            <w:r>
-              <w:rPr>
-                <w:rFonts w:ascii="メイリオ" w:hAnsi="メイリオ" w:eastAsia="メイリオ"/>
-                <w:sz w:val="18"/>
-              </w:rPr>
-              <w:t>今週中</w:t>
-            </w:r>
-          </w:p>
-        </w:tc>
-        <w:tc>
-          <w:tcPr>
-            <w:tcW w:type="dxa" w:w="3249"/>
-          </w:tcPr>
-          <w:p>
-            <w:r>
-              <w:rPr>
-                <w:rFonts w:ascii="メイリオ" w:hAnsi="メイリオ" w:eastAsia="メイリオ"/>
-                <w:sz w:val="18"/>
-              </w:rPr>
-              <w:t>能登事業者支援センター(0120-262-380)で事業内容事前確認書の発行依頼</w:t>
-            </w:r>
-          </w:p>
-        </w:tc>
-        <w:tc>
-          <w:tcPr>
-            <w:tcW w:type="dxa" w:w="3249"/>
-          </w:tcPr>
-          <w:p>
-            <w:r>
-              <w:rPr>
-                <w:rFonts w:ascii="メイリオ" w:hAnsi="メイリオ" w:eastAsia="メイリオ"/>
-                <w:sz w:val="18"/>
-              </w:rPr>
-              <w:t>小川氏</w:t>
-            </w:r>
-          </w:p>
-        </w:tc>
-      </w:tr>
-      <w:tr>
-        <w:tc>
-          <w:tcPr>
-            <w:tcW w:type="dxa" w:w="3249"/>
-            <w:shd w:val="clear" w:color="auto" w:fill="F2F7FC"/>
-          </w:tcPr>
-          <w:p>
-            <w:r>
-              <w:rPr>
-                <w:rFonts w:ascii="メイリオ" w:hAnsi="メイリオ" w:eastAsia="メイリオ"/>
-                <w:sz w:val="18"/>
-              </w:rPr>
-              <w:t>今月中</w:t>
-            </w:r>
-          </w:p>
-        </w:tc>
-        <w:tc>
-          <w:tcPr>
-            <w:tcW w:type="dxa" w:w="3249"/>
-            <w:shd w:val="clear" w:color="auto" w:fill="F2F7FC"/>
-          </w:tcPr>
-          <w:p>
-            <w:r>
-              <w:rPr>
-                <w:rFonts w:ascii="メイリオ" w:hAnsi="メイリオ" w:eastAsia="メイリオ"/>
-                <w:sz w:val="18"/>
-              </w:rPr>
-              <w:t>漁協証明・確定申告書を取り寄せ、震災前後の売上データ整備</w:t>
-            </w:r>
-          </w:p>
-        </w:tc>
-        <w:tc>
-          <w:tcPr>
-            <w:tcW w:type="dxa" w:w="3249"/>
-            <w:shd w:val="clear" w:color="auto" w:fill="F2F7FC"/>
-          </w:tcPr>
-          <w:p>
-            <w:r>
-              <w:rPr>
-                <w:rFonts w:ascii="メイリオ" w:hAnsi="メイリオ" w:eastAsia="メイリオ"/>
-                <w:sz w:val="18"/>
-              </w:rPr>
-              <w:t>小川氏</w:t>
-            </w:r>
-          </w:p>
-        </w:tc>
-      </w:tr>
-      <w:tr>
-        <w:tc>
-          <w:tcPr>
-            <w:tcW w:type="dxa" w:w="3249"/>
-          </w:tcPr>
-          <w:p>
-            <w:r>
-              <w:rPr>
-                <w:rFonts w:ascii="メイリオ" w:hAnsi="メイリオ" w:eastAsia="メイリオ"/>
-                <w:sz w:val="18"/>
-              </w:rPr>
-              <w:t>今月中</w:t>
-            </w:r>
-          </w:p>
-        </w:tc>
-        <w:tc>
-          <w:tcPr>
-            <w:tcW w:type="dxa" w:w="3249"/>
-          </w:tcPr>
-          <w:p>
-            <w:r>
-              <w:rPr>
-                <w:rFonts w:ascii="メイリオ" w:hAnsi="メイリオ" w:eastAsia="メイリオ"/>
-                <w:sz w:val="18"/>
-              </w:rPr>
-              <w:t>能登町商工会で計画策定確認書の準備開始</w:t>
-            </w:r>
-          </w:p>
-        </w:tc>
-        <w:tc>
-          <w:tcPr>
-            <w:tcW w:type="dxa" w:w="3249"/>
-          </w:tcPr>
-          <w:p>
-            <w:r>
-              <w:rPr>
-                <w:rFonts w:ascii="メイリオ" w:hAnsi="メイリオ" w:eastAsia="メイリオ"/>
-                <w:sz w:val="18"/>
-              </w:rPr>
-              <w:t>小川氏</w:t>
-            </w:r>
-          </w:p>
-        </w:tc>
-      </w:tr>
-      <w:tr>
-        <w:tc>
-          <w:tcPr>
-            <w:tcW w:type="dxa" w:w="3249"/>
-            <w:shd w:val="clear" w:color="auto" w:fill="F2F7FC"/>
-          </w:tcPr>
-          <w:p>
-            <w:r>
-              <w:rPr>
-                <w:rFonts w:ascii="メイリオ" w:hAnsi="メイリオ" w:eastAsia="メイリオ"/>
-                <w:sz w:val="18"/>
-              </w:rPr>
-              <w:t>5月上旬</w:t>
-            </w:r>
-          </w:p>
-        </w:tc>
-        <w:tc>
-          <w:tcPr>
-            <w:tcW w:type="dxa" w:w="3249"/>
-            <w:shd w:val="clear" w:color="auto" w:fill="F2F7FC"/>
-          </w:tcPr>
-          <w:p>
-            <w:r>
-              <w:rPr>
-                <w:rFonts w:ascii="メイリオ" w:hAnsi="メイリオ" w:eastAsia="メイリオ"/>
-                <w:sz w:val="18"/>
-              </w:rPr>
-              <w:t>事業計画書を米永(CBC)と共同作成。起業促進とチャレンジの経費を分離</w:t>
-            </w:r>
-          </w:p>
-        </w:tc>
-        <w:tc>
-          <w:tcPr>
-            <w:tcW w:type="dxa" w:w="3249"/>
-            <w:shd w:val="clear" w:color="auto" w:fill="F2F7FC"/>
-          </w:tcPr>
-          <w:p>
-            <w:r>
-              <w:rPr>
-                <w:rFonts w:ascii="メイリオ" w:hAnsi="メイリオ" w:eastAsia="メイリオ"/>
-                <w:sz w:val="18"/>
-              </w:rPr>
-              <w:t>米永+小川</w:t>
-            </w:r>
-          </w:p>
-        </w:tc>
-      </w:tr>
-      <w:tr>
-        <w:tc>
-          <w:tcPr>
-            <w:tcW w:type="dxa" w:w="3249"/>
-          </w:tcPr>
-          <w:p>
-            <w:r>
-              <w:rPr>
-                <w:rFonts w:ascii="メイリオ" w:hAnsi="メイリオ" w:eastAsia="メイリオ"/>
-                <w:sz w:val="18"/>
-              </w:rPr>
-              <w:t>5月中旬</w:t>
-            </w:r>
-          </w:p>
-        </w:tc>
-        <w:tc>
-          <w:tcPr>
-            <w:tcW w:type="dxa" w:w="3249"/>
-          </w:tcPr>
-          <w:p>
-            <w:r>
-              <w:rPr>
-                <w:rFonts w:ascii="メイリオ" w:hAnsi="メイリオ" w:eastAsia="メイリオ"/>
-                <w:sz w:val="18"/>
-              </w:rPr>
-              <w:t>経費明細を確定。試作テスト実施</w:t>
-            </w:r>
-          </w:p>
-        </w:tc>
-        <w:tc>
-          <w:tcPr>
-            <w:tcW w:type="dxa" w:w="3249"/>
-          </w:tcPr>
-          <w:p>
-            <w:r>
-              <w:rPr>
-                <w:rFonts w:ascii="メイリオ" w:hAnsi="メイリオ" w:eastAsia="メイリオ"/>
-                <w:sz w:val="18"/>
-              </w:rPr>
-              <w:t>全員</w:t>
-            </w:r>
-          </w:p>
-        </w:tc>
-      </w:tr>
-      <w:tr>
-        <w:tc>
-          <w:tcPr>
-            <w:tcW w:type="dxa" w:w="3249"/>
-            <w:shd w:val="clear" w:color="auto" w:fill="F2F7FC"/>
-          </w:tcPr>
-          <w:p>
-            <w:r>
-              <w:rPr>
-                <w:rFonts w:ascii="メイリオ" w:hAnsi="メイリオ" w:eastAsia="メイリオ"/>
-                <w:sz w:val="18"/>
-              </w:rPr>
-              <w:t>5月29日</w:t>
-            </w:r>
-          </w:p>
-        </w:tc>
-        <w:tc>
-          <w:tcPr>
-            <w:tcW w:type="dxa" w:w="3249"/>
-            <w:shd w:val="clear" w:color="auto" w:fill="F2F7FC"/>
-          </w:tcPr>
-          <w:p>
-            <w:r>
-              <w:rPr>
-                <w:rFonts w:ascii="メイリオ" w:hAnsi="メイリオ" w:eastAsia="メイリオ"/>
-                <w:sz w:val="18"/>
-              </w:rPr>
-              <w:t>チャレンジ支援補助金 7次 書類郵送（消印有効）</w:t>
-            </w:r>
-          </w:p>
-        </w:tc>
-        <w:tc>
-          <w:tcPr>
-            <w:tcW w:type="dxa" w:w="3249"/>
-            <w:shd w:val="clear" w:color="auto" w:fill="F2F7FC"/>
-          </w:tcPr>
-          <w:p>
-            <w:r>
-              <w:rPr>
-                <w:rFonts w:ascii="メイリオ" w:hAnsi="メイリオ" w:eastAsia="メイリオ"/>
-                <w:sz w:val="18"/>
-              </w:rPr>
-              <w:t>小川氏</w:t>
-            </w:r>
-          </w:p>
-        </w:tc>
-      </w:tr>
-      <w:tr>
-        <w:tc>
-          <w:tcPr>
-            <w:tcW w:type="dxa" w:w="3249"/>
-          </w:tcPr>
-          <w:p>
-            <w:r>
-              <w:rPr>
-                <w:rFonts w:ascii="メイリオ" w:hAnsi="メイリオ" w:eastAsia="メイリオ"/>
-                <w:sz w:val="18"/>
-              </w:rPr>
-              <w:t>並行</w:t>
-            </w:r>
-          </w:p>
-        </w:tc>
-        <w:tc>
-          <w:tcPr>
-            <w:tcW w:type="dxa" w:w="3249"/>
-          </w:tcPr>
-          <w:p>
-            <w:r>
-              <w:rPr>
-                <w:rFonts w:ascii="メイリオ" w:hAnsi="メイリオ" w:eastAsia="メイリオ"/>
-                <w:sz w:val="18"/>
-              </w:rPr>
-              <w:t>起業促進補助金も別経費・別計画で申請</w:t>
-            </w:r>
-          </w:p>
-        </w:tc>
-        <w:tc>
-          <w:tcPr>
-            <w:tcW w:type="dxa" w:w="3249"/>
-          </w:tcPr>
-          <w:p>
-            <w:r>
-              <w:rPr>
-                <w:rFonts w:ascii="メイリオ" w:hAnsi="メイリオ" w:eastAsia="メイリオ"/>
-                <w:sz w:val="18"/>
-              </w:rPr>
-              <w:t>小川氏</w:t>
-            </w:r>
-          </w:p>
-        </w:tc>
-      </w:tr>
-    </w:tbl>
-    <w:p/>
-    <w:p>
-      <w:pPr>
-        <w:shd w:val="clear" w:color="auto" w:fill="FFF2CC"/>
-        <w:spacing w:after="120"/>
-        <w:ind w:left="170"/>
-      </w:pPr>
-      <w:r>
-        <w:rPr>
-          <w:rFonts w:ascii="メイリオ" w:hAnsi="メイリオ" w:eastAsia="メイリオ"/>
-          <w:color w:val="7F6000"/>
-          <w:sz w:val="18"/>
-        </w:rPr>
-        <w:t>★ 7次が間に合わなければ8次（7/31）へ。試作結果を添付でき採択率が上がる。</w:t>
-      </w:r>
-    </w:p>
-    <w:p>
-      <w:pPr>
-        <w:jc w:val="center"/>
-      </w:pPr>
-      <w:r>
-        <w:rPr>
-          <w:color w:val="1F497D"/>
-          <w:sz w:val="18"/>
-        </w:rPr>
-        <w:t>━━━━━━━━━━━━━━━━━━━━━━━━━━━━━━━━━━━━━━━━</w:t>
-      </w:r>
-    </w:p>
-    <w:p>
-      <w:pPr>
-        <w:pStyle w:val="Heading2"/>
-        <w:shd w:val="clear" w:color="auto" w:fill="C00000"/>
-        <w:spacing w:before="200" w:after="80"/>
-      </w:pPr>
-      <w:r>
-        <w:rPr>
-          <w:rFonts w:ascii="メイリオ" w:hAnsi="メイリオ" w:eastAsia="メイリオ"/>
-          <w:color w:val="FFFFFF"/>
-          <w:sz w:val="24"/>
-        </w:rPr>
-        <w:t>【重要更新】申請締切スケジュール（2026年6月3日時点）</w:t>
+        <w:t>6. 申請締切スケジュール（2026年6月3日時点・最新）</w:t>
       </w:r>
     </w:p>
     <w:p>
@@ -2437,7 +2012,7 @@
                 <w:rFonts w:ascii="メイリオ" w:hAnsi="メイリオ" w:eastAsia="メイリオ"/>
                 <w:sz w:val="18"/>
               </w:rPr>
-              <w:t>試作テスト（7月実施）の結果を添付可能。最推奨</w:t>
+              <w:t>試作テスト（7月）の結果を添付可能。最推奨</w:t>
             </w:r>
           </w:p>
         </w:tc>
@@ -2696,7 +2271,7 @@
           <w:color w:val="FFFFFF"/>
           <w:sz w:val="24"/>
         </w:rPr>
-        <w:t>8次（7月31日）に向けた行動計画</w:t>
+        <w:t>7. 8次（7月31日）に向けた行動計画</w:t>
       </w:r>
     </w:p>
     <w:p>
@@ -3182,7 +2757,7 @@
         <w:color w:val="707070"/>
         <w:sz w:val="16"/>
       </w:rPr>
-      <w:t>能登フィッシュバーガー 事業計画書骨子【確定版・締切更新済み 2026.6.3】 ／ 小川勝則（漁師）　作成：CBC（米永）</w:t>
+      <w:t>能登フィッシュバーガー 事業計画書骨子【確定版・締切更新 2026.6.3】 ／ 小川勝則（漁師）　作成：CBC（米永）</w:t>
     </w:r>
   </w:p>
 </w:ftr>

</xml_diff>